<commit_message>
Fix: Restore and highlight token dragging
</commit_message>
<xml_diff>
--- a/docs/Blaty_RPG_Podrecznik_Uzytkownika.docx
+++ b/docs/Blaty_RPG_Podrecznik_Uzytkownika.docx
@@ -1466,7 +1466,12 @@
         <w:pStyle w:val="Heading2"/>
       </w:pPr>
       <w:r>
-        <w:t>5.2 Tokeny — CZĘŚCIOWO</w:t>
+        <w:t>5.2 Tokeny — DOSTĘPNE</w:t>
+      </w:r>
+    </w:p>
+    <w:p>
+      <w:r>
+        <w:t>Token jest reprezentacją postaci lub NPC na scenie. Tworzenie tokena odbywa się przez przeciągnięcie postaci z okna Postacie na Canvas. Token przechowuje pozycję, rozmiar, obrót, elevation, nazwę, obraz, stan blokady i powiązanie z postacią.</w:t>
       </w:r>
     </w:p>
     <w:p>
@@ -1474,27 +1479,15 @@
         <w:rPr>
           <w:b w:val="0"/>
         </w:rPr>
-        <w:t xml:space="preserve">Token jest reprezentacją postaci lub NPC na scenie. Obsługa istniejących tokenów, ich kontrola i synchronizacja są dostępne. Docelowy przepływ tworzenia tokena odbywa się przez przeciągnięcie postaci z okna </w:t>
-      </w:r>
-      <w:r>
-        <w:rPr>
-          <w:b/>
-        </w:rPr>
-        <w:t>Postacie</w:t>
-      </w:r>
-      <w:r>
-        <w:rPr>
-          <w:b w:val="0"/>
-        </w:rPr>
-        <w:t xml:space="preserve"> na Canvas; pełne udostępnienie tego gestu w oknie Postaci wymaga jeszcze domknięcia integracji UI. Token przechowuje pozycję, rozmiar, obrót, elevation, nazwę, obraz, stan blokady i powiązanie z postacią.</w:t>
-      </w:r>
-    </w:p>
-    <w:p>
-      <w:r>
-        <w:rPr>
-          <w:b w:val="0"/>
-        </w:rPr>
         <w:t>Jak używać:</w:t>
+      </w:r>
+    </w:p>
+    <w:p>
+      <w:pPr>
+        <w:ind w:left="369" w:hanging="255"/>
+      </w:pPr>
+      <w:r>
+        <w:t>1. Dwukliknij ikonę Postacie na prawym pasku.</w:t>
       </w:r>
     </w:p>
     <w:p>
@@ -1506,25 +1499,13 @@
           <w:b/>
           <w:color w:val="B88746"/>
         </w:rPr>
-        <w:t xml:space="preserve">1. </w:t>
+        <w:t xml:space="preserve">2. </w:t>
       </w:r>
       <w:r>
         <w:rPr>
           <w:b w:val="0"/>
         </w:rPr>
-        <w:t xml:space="preserve">Po udostępnieniu tworzenia dla danej roli dwukliknij ikonę </w:t>
-      </w:r>
-      <w:r>
-        <w:rPr>
-          <w:b/>
-        </w:rPr>
-        <w:t>Postacie</w:t>
-      </w:r>
-      <w:r>
-        <w:rPr>
-          <w:b w:val="0"/>
-        </w:rPr>
-        <w:t xml:space="preserve"> na prawym pasku.</w:t>
+        <w:t>Wyszukaj postać.</w:t>
       </w:r>
     </w:p>
     <w:p>
@@ -1536,13 +1517,13 @@
           <w:b/>
           <w:color w:val="B88746"/>
         </w:rPr>
-        <w:t xml:space="preserve">2. </w:t>
+        <w:t xml:space="preserve">3. </w:t>
       </w:r>
       <w:r>
         <w:rPr>
           <w:b w:val="0"/>
         </w:rPr>
-        <w:t>Wyszukaj postać.</w:t>
+        <w:t>Przeciągnij postać z listy na wybrane pole mapy.</w:t>
       </w:r>
     </w:p>
     <w:p>
@@ -1554,13 +1535,13 @@
           <w:b/>
           <w:color w:val="B88746"/>
         </w:rPr>
-        <w:t xml:space="preserve">3. </w:t>
+        <w:t xml:space="preserve">4. </w:t>
       </w:r>
       <w:r>
         <w:rPr>
           <w:b w:val="0"/>
         </w:rPr>
-        <w:t>Przeciągnij postać z listy na wybrane pole mapy.</w:t>
+        <w:t>Kliknij token. HUD pozwala obracać go w lewo lub prawo, otworzyć kartę postaci albo — dla MG — usunąć token.</w:t>
       </w:r>
     </w:p>
     <w:p>
@@ -1572,39 +1553,18 @@
           <w:b/>
           <w:color w:val="B88746"/>
         </w:rPr>
-        <w:t xml:space="preserve">4. </w:t>
+        <w:t xml:space="preserve">5. </w:t>
       </w:r>
       <w:r>
         <w:rPr>
           <w:b w:val="0"/>
         </w:rPr>
-        <w:t>Kliknij token. HUD pozwala obracać go w lewo lub prawo, otworzyć kartę postaci albo — dla MG — usunąć token.</w:t>
-      </w:r>
-    </w:p>
-    <w:p>
-      <w:pPr>
-        <w:ind w:left="369" w:hanging="255"/>
-      </w:pPr>
-      <w:r>
-        <w:rPr>
-          <w:b/>
-          <w:color w:val="B88746"/>
-        </w:rPr>
-        <w:t xml:space="preserve">5. </w:t>
-      </w:r>
-      <w:r>
-        <w:rPr>
-          <w:b w:val="0"/>
-        </w:rPr>
         <w:t>Przeciągnij token, aby zmienić pozycję. Ruch zostanie zatwierdzony przez serwer i zsynchronizowany.</w:t>
       </w:r>
     </w:p>
     <w:p>
       <w:r>
-        <w:rPr>
-          <w:b w:val="0"/>
-        </w:rPr>
-        <w:t>Ściana blokująca ruch lub zamknięte drzwi zatrzymają niedozwolone przesunięcie. Gracz może poruszać tylko kontrolowanym, nieblokowanym tokenem.</w:t>
+        <w:t>Podczas przeciągania aktywny token unosi się ponad mapę i pulsuje złotym światłem. W punkcie startowym pozostaje jego półprzezroczysty „duch”, animowany ślad prowadzi do celownika upuszczenia, a etykieta pokazuje nazwę tokena i aktualny dystans. Ściana blokująca ruch lub zamknięte drzwi zatrzymają niedozwolone przesunięcie. Gracz może poruszać tylko kontrolowanym, nieblokowanym tokenem.</w:t>
       </w:r>
     </w:p>
     <w:p>
@@ -3394,10 +3354,7 @@
     </w:p>
     <w:p>
       <w:r>
-        <w:rPr>
-          <w:b w:val="0"/>
-        </w:rPr>
-        <w:t>Okno zawiera wyszukiwarkę, listę postaci i pełny edytor karty. Można odświeżać dane, wybierać kartę, zapisywać zmiany i — przy odpowiednich uprawnieniach — usuwać postać. Docelowa integracja pozwala przeciągnąć postać na Canvas, aby utworzyć powiązany token; udostępnienie tego gestu w oknie Postaci wymaga jeszcze domknięcia UI.</w:t>
+        <w:t>Okno zawiera wyszukiwarkę, listę postaci i pełny edytor karty. Można odświeżać dane, wybierać kartę, zapisywać zmiany i — przy odpowiednich uprawnieniach — usuwać postać. Postać można przeciągnąć na Canvas, aby utworzyć powiązany token.</w:t>
       </w:r>
     </w:p>
     <w:p>
@@ -5124,9 +5081,9 @@
             <w:r>
               <w:rPr>
                 <w:b/>
-                <w:color w:val="9B651B"/>
+                <w:color w:val="2E6B4F"/>
               </w:rPr>
-              <w:t>CZĘŚCIOWO</w:t>
+              <w:t>DOSTĘPNE</w:t>
             </w:r>
           </w:p>
         </w:tc>
@@ -5144,10 +5101,7 @@
           </w:tcPr>
           <w:p>
             <w:r>
-              <w:rPr>
-                <w:b w:val="0"/>
-              </w:rPr>
-              <w:t>Kontrola działa; tworzenie z okna Postaci i rozbudowane statusy wymagają domknięcia.</w:t>
+              <w:t>Tworzenie i kontrola działają; rozbudowane zasoby oraz statusy tokena są planowane.</w:t>
             </w:r>
           </w:p>
         </w:tc>

</xml_diff>